<commit_message>
fix: switch to detailed NYC data and fix cleaning pipeline
- Replace summary listings/reviews with the detailed Inside Airbnb NYC
  snapshot (06/2026); store reviews as reviews.csv.xz (310 MB -> 73 MB)
- 01_data_cleaning.R: parse "$" price text, use *_cleansed columns,
  keep only analysis columns, read id as text
- prepare_airbnb_model.R: relative paths, UTF-8 comments, snapshot-based
  dates, stay_type and has_reviews features
- Report and README: correct year, real dataset sizes, cleaning
  rationale, text-processing steps, updated features

Co-Authored-By: Claude Opus 5.5 (1M context) <noreply@anthropic.com>
</commit_message>
<xml_diff>
--- a/DTA301-NYC-Airbnb-Analysis/report/DTA301_Group_4_Phase_1_2.docx
+++ b/DTA301-NYC-Airbnb-Analysis/report/DTA301_Group_4_Phase_1_2.docx
@@ -120,7 +120,7 @@
           <w:sz w:val="21"/>
           <w:szCs w:val="21"/>
         </w:rPr>
-        <w:t xml:space="preserve"> Thành phố New York (Mỹ), bản ghi năm 2024.</w:t>
+        <w:t xml:space="preserve"> Thành phố New York (Mỹ), snapshot tháng 06/2026 (scrape ngày 14–23/06/2026).</w:t>
       </w:r>
     </w:p>
     <w:p>
@@ -1772,14 +1772,14 @@
         <w:rPr>
           <w:rFonts w:ascii="Calibri" w:hAnsi="Calibri" w:cs="Calibri"/>
         </w:rPr>
-        <w:t xml:space="preserve">t năm </w:t>
+        <w:t xml:space="preserve">t tháng </w:t>
       </w:r>
       <w:r>
         <w:rPr>
           <w:rStyle w:val="Strong"/>
           <w:rFonts w:ascii="Calibri" w:hAnsi="Calibri" w:cs="Calibri"/>
         </w:rPr>
-        <w:t>2024</w:t>
+        <w:t>06/2026</w:t>
       </w:r>
       <w:r>
         <w:rPr>
@@ -2438,7 +2438,7 @@
               <w:rPr>
                 <w:rStyle w:val="HTMLCode"/>
               </w:rPr>
-              <w:t>neighbourhood</w:t>
+              <w:t>neighbourhood_cleansed</w:t>
             </w:r>
           </w:p>
         </w:tc>
@@ -2539,7 +2539,7 @@
               <w:rPr>
                 <w:rStyle w:val="HTMLCode"/>
               </w:rPr>
-              <w:t>room_type</w:t>
+              <w:t>neighbourhood_group_cleansed</w:t>
             </w:r>
           </w:p>
         </w:tc>
@@ -2572,7 +2572,7 @@
               <w:rPr>
                 <w:rFonts w:ascii="Calibri" w:eastAsia="Times New Roman" w:hAnsi="Calibri" w:cs="Calibri"/>
               </w:rPr>
-              <w:t>Phân loại phòng</w:t>
+              <w:t>Quận (5 borough của NYC)</w:t>
             </w:r>
           </w:p>
         </w:tc>
@@ -2640,7 +2640,7 @@
               <w:rPr>
                 <w:rStyle w:val="HTMLCode"/>
               </w:rPr>
-              <w:t>price</w:t>
+              <w:t>room_type</w:t>
             </w:r>
           </w:p>
         </w:tc>
@@ -2673,7 +2673,108 @@
               <w:rPr>
                 <w:rFonts w:ascii="Calibri" w:eastAsia="Times New Roman" w:hAnsi="Calibri" w:cs="Calibri"/>
               </w:rPr>
-              <w:t>Giá thuê tính theo đêm</w:t>
+              <w:t>Phân loại phòng</w:t>
+            </w:r>
+          </w:p>
+        </w:tc>
+        <w:tc>
+          <w:tcPr>
+            <w:tcW w:w="0" w:type="auto"/>
+            <w:tcBorders>
+              <w:top w:val="single" w:sz="6" w:space="0" w:color="000000"/>
+              <w:left w:val="single" w:sz="6" w:space="0" w:color="000000"/>
+              <w:bottom w:val="single" w:sz="6" w:space="0" w:color="000000"/>
+              <w:right w:val="single" w:sz="6" w:space="0" w:color="000000"/>
+            </w:tcBorders>
+            <w:tcMar>
+              <w:top w:w="120" w:type="dxa"/>
+              <w:left w:w="120" w:type="dxa"/>
+              <w:bottom w:w="120" w:type="dxa"/>
+              <w:right w:w="120" w:type="dxa"/>
+            </w:tcMar>
+            <w:vAlign w:val="center"/>
+            <w:hideMark/>
+          </w:tcPr>
+          <w:p>
+            <w:pPr>
+              <w:spacing w:after="300"/>
+              <w:rPr>
+                <w:rFonts w:ascii="Calibri" w:eastAsia="Times New Roman" w:hAnsi="Calibri" w:cs="Calibri"/>
+              </w:rPr>
+            </w:pPr>
+            <w:r>
+              <w:rPr>
+                <w:rFonts w:ascii="Calibri" w:eastAsia="Times New Roman" w:hAnsi="Calibri" w:cs="Calibri"/>
+              </w:rPr>
+              <w:t>Categorical</w:t>
+            </w:r>
+          </w:p>
+        </w:tc>
+      </w:tr>
+      <w:tr>
+        <w:tc>
+          <w:tcPr>
+            <w:tcW w:w="0" w:type="auto"/>
+            <w:tcBorders>
+              <w:top w:val="single" w:sz="6" w:space="0" w:color="000000"/>
+              <w:left w:val="single" w:sz="6" w:space="0" w:color="000000"/>
+              <w:bottom w:val="single" w:sz="6" w:space="0" w:color="000000"/>
+              <w:right w:val="single" w:sz="6" w:space="0" w:color="000000"/>
+            </w:tcBorders>
+            <w:tcMar>
+              <w:top w:w="120" w:type="dxa"/>
+              <w:left w:w="120" w:type="dxa"/>
+              <w:bottom w:w="120" w:type="dxa"/>
+              <w:right w:w="120" w:type="dxa"/>
+            </w:tcMar>
+            <w:vAlign w:val="center"/>
+            <w:hideMark/>
+          </w:tcPr>
+          <w:p>
+            <w:pPr>
+              <w:spacing w:after="300"/>
+              <w:rPr>
+                <w:rFonts w:ascii="Calibri" w:eastAsia="Times New Roman" w:hAnsi="Calibri" w:cs="Calibri"/>
+              </w:rPr>
+            </w:pPr>
+            <w:r>
+              <w:rPr>
+                <w:rStyle w:val="HTMLCode"/>
+              </w:rPr>
+              <w:t>accommodates</w:t>
+            </w:r>
+          </w:p>
+        </w:tc>
+        <w:tc>
+          <w:tcPr>
+            <w:tcW w:w="0" w:type="auto"/>
+            <w:tcBorders>
+              <w:top w:val="single" w:sz="6" w:space="0" w:color="000000"/>
+              <w:left w:val="single" w:sz="6" w:space="0" w:color="000000"/>
+              <w:bottom w:val="single" w:sz="6" w:space="0" w:color="000000"/>
+              <w:right w:val="single" w:sz="6" w:space="0" w:color="000000"/>
+            </w:tcBorders>
+            <w:tcMar>
+              <w:top w:w="120" w:type="dxa"/>
+              <w:left w:w="120" w:type="dxa"/>
+              <w:bottom w:w="120" w:type="dxa"/>
+              <w:right w:w="120" w:type="dxa"/>
+            </w:tcMar>
+            <w:vAlign w:val="center"/>
+            <w:hideMark/>
+          </w:tcPr>
+          <w:p>
+            <w:pPr>
+              <w:spacing w:after="300"/>
+              <w:rPr>
+                <w:rFonts w:ascii="Calibri" w:eastAsia="Times New Roman" w:hAnsi="Calibri" w:cs="Calibri"/>
+              </w:rPr>
+            </w:pPr>
+            <w:r>
+              <w:rPr>
+                <w:rFonts w:ascii="Calibri" w:eastAsia="Times New Roman" w:hAnsi="Calibri" w:cs="Calibri"/>
+              </w:rPr>
+              <w:t>Sức chứa (số khách)</w:t>
             </w:r>
           </w:p>
         </w:tc>
@@ -2741,6 +2842,107 @@
               <w:rPr>
                 <w:rStyle w:val="HTMLCode"/>
               </w:rPr>
+              <w:t>price</w:t>
+            </w:r>
+          </w:p>
+        </w:tc>
+        <w:tc>
+          <w:tcPr>
+            <w:tcW w:w="0" w:type="auto"/>
+            <w:tcBorders>
+              <w:top w:val="single" w:sz="6" w:space="0" w:color="000000"/>
+              <w:left w:val="single" w:sz="6" w:space="0" w:color="000000"/>
+              <w:bottom w:val="single" w:sz="6" w:space="0" w:color="000000"/>
+              <w:right w:val="single" w:sz="6" w:space="0" w:color="000000"/>
+            </w:tcBorders>
+            <w:tcMar>
+              <w:top w:w="120" w:type="dxa"/>
+              <w:left w:w="120" w:type="dxa"/>
+              <w:bottom w:w="120" w:type="dxa"/>
+              <w:right w:w="120" w:type="dxa"/>
+            </w:tcMar>
+            <w:vAlign w:val="center"/>
+            <w:hideMark/>
+          </w:tcPr>
+          <w:p>
+            <w:pPr>
+              <w:spacing w:after="300"/>
+              <w:rPr>
+                <w:rFonts w:ascii="Calibri" w:eastAsia="Times New Roman" w:hAnsi="Calibri" w:cs="Calibri"/>
+              </w:rPr>
+            </w:pPr>
+            <w:r>
+              <w:rPr>
+                <w:rFonts w:ascii="Calibri" w:eastAsia="Times New Roman" w:hAnsi="Calibri" w:cs="Calibri"/>
+              </w:rPr>
+              <w:t>Giá thuê tính theo đêm</w:t>
+            </w:r>
+          </w:p>
+        </w:tc>
+        <w:tc>
+          <w:tcPr>
+            <w:tcW w:w="0" w:type="auto"/>
+            <w:tcBorders>
+              <w:top w:val="single" w:sz="6" w:space="0" w:color="000000"/>
+              <w:left w:val="single" w:sz="6" w:space="0" w:color="000000"/>
+              <w:bottom w:val="single" w:sz="6" w:space="0" w:color="000000"/>
+              <w:right w:val="single" w:sz="6" w:space="0" w:color="000000"/>
+            </w:tcBorders>
+            <w:tcMar>
+              <w:top w:w="120" w:type="dxa"/>
+              <w:left w:w="120" w:type="dxa"/>
+              <w:bottom w:w="120" w:type="dxa"/>
+              <w:right w:w="120" w:type="dxa"/>
+            </w:tcMar>
+            <w:vAlign w:val="center"/>
+            <w:hideMark/>
+          </w:tcPr>
+          <w:p>
+            <w:pPr>
+              <w:spacing w:after="300"/>
+              <w:rPr>
+                <w:rFonts w:ascii="Calibri" w:eastAsia="Times New Roman" w:hAnsi="Calibri" w:cs="Calibri"/>
+              </w:rPr>
+            </w:pPr>
+            <w:r>
+              <w:rPr>
+                <w:rFonts w:ascii="Calibri" w:eastAsia="Times New Roman" w:hAnsi="Calibri" w:cs="Calibri"/>
+              </w:rPr>
+              <w:t>Text ("$1,234.00") → Numerical</w:t>
+            </w:r>
+          </w:p>
+        </w:tc>
+      </w:tr>
+      <w:tr>
+        <w:tc>
+          <w:tcPr>
+            <w:tcW w:w="0" w:type="auto"/>
+            <w:tcBorders>
+              <w:top w:val="single" w:sz="6" w:space="0" w:color="000000"/>
+              <w:left w:val="single" w:sz="6" w:space="0" w:color="000000"/>
+              <w:bottom w:val="single" w:sz="6" w:space="0" w:color="000000"/>
+              <w:right w:val="single" w:sz="6" w:space="0" w:color="000000"/>
+            </w:tcBorders>
+            <w:tcMar>
+              <w:top w:w="120" w:type="dxa"/>
+              <w:left w:w="120" w:type="dxa"/>
+              <w:bottom w:w="120" w:type="dxa"/>
+              <w:right w:w="120" w:type="dxa"/>
+            </w:tcMar>
+            <w:vAlign w:val="center"/>
+            <w:hideMark/>
+          </w:tcPr>
+          <w:p>
+            <w:pPr>
+              <w:spacing w:after="300"/>
+              <w:rPr>
+                <w:rFonts w:ascii="Calibri" w:eastAsia="Times New Roman" w:hAnsi="Calibri" w:cs="Calibri"/>
+              </w:rPr>
+            </w:pPr>
+            <w:r>
+              <w:rPr>
+                <w:rStyle w:val="HTMLCode"/>
+              </w:rPr>
               <w:t>minimum_nights</w:t>
             </w:r>
           </w:p>
@@ -3115,6 +3317,107 @@
           </w:p>
         </w:tc>
       </w:tr>
+      <w:tr>
+        <w:tc>
+          <w:tcPr>
+            <w:tcW w:w="0" w:type="auto"/>
+            <w:tcBorders>
+              <w:top w:val="single" w:sz="6" w:space="0" w:color="000000"/>
+              <w:left w:val="single" w:sz="6" w:space="0" w:color="000000"/>
+              <w:bottom w:val="single" w:sz="6" w:space="0" w:color="000000"/>
+              <w:right w:val="single" w:sz="6" w:space="0" w:color="000000"/>
+            </w:tcBorders>
+            <w:tcMar>
+              <w:top w:w="120" w:type="dxa"/>
+              <w:left w:w="120" w:type="dxa"/>
+              <w:bottom w:w="120" w:type="dxa"/>
+              <w:right w:w="120" w:type="dxa"/>
+            </w:tcMar>
+            <w:vAlign w:val="center"/>
+            <w:hideMark/>
+          </w:tcPr>
+          <w:p>
+            <w:pPr>
+              <w:spacing w:after="300"/>
+              <w:rPr>
+                <w:rFonts w:ascii="Calibri" w:eastAsia="Times New Roman" w:hAnsi="Calibri" w:cs="Calibri"/>
+              </w:rPr>
+            </w:pPr>
+            <w:r>
+              <w:rPr>
+                <w:rStyle w:val="HTMLCode"/>
+              </w:rPr>
+              <w:t>review_scores_rating</w:t>
+            </w:r>
+          </w:p>
+        </w:tc>
+        <w:tc>
+          <w:tcPr>
+            <w:tcW w:w="0" w:type="auto"/>
+            <w:tcBorders>
+              <w:top w:val="single" w:sz="6" w:space="0" w:color="000000"/>
+              <w:left w:val="single" w:sz="6" w:space="0" w:color="000000"/>
+              <w:bottom w:val="single" w:sz="6" w:space="0" w:color="000000"/>
+              <w:right w:val="single" w:sz="6" w:space="0" w:color="000000"/>
+            </w:tcBorders>
+            <w:tcMar>
+              <w:top w:w="120" w:type="dxa"/>
+              <w:left w:w="120" w:type="dxa"/>
+              <w:bottom w:w="120" w:type="dxa"/>
+              <w:right w:w="120" w:type="dxa"/>
+            </w:tcMar>
+            <w:vAlign w:val="center"/>
+            <w:hideMark/>
+          </w:tcPr>
+          <w:p>
+            <w:pPr>
+              <w:spacing w:after="300"/>
+              <w:rPr>
+                <w:rFonts w:ascii="Calibri" w:eastAsia="Times New Roman" w:hAnsi="Calibri" w:cs="Calibri"/>
+              </w:rPr>
+            </w:pPr>
+            <w:r>
+              <w:rPr>
+                <w:rFonts w:ascii="Calibri" w:eastAsia="Times New Roman" w:hAnsi="Calibri" w:cs="Calibri"/>
+              </w:rPr>
+              <w:t>Điểm đánh giá trung bình (0–5)</w:t>
+            </w:r>
+          </w:p>
+        </w:tc>
+        <w:tc>
+          <w:tcPr>
+            <w:tcW w:w="0" w:type="auto"/>
+            <w:tcBorders>
+              <w:top w:val="single" w:sz="6" w:space="0" w:color="000000"/>
+              <w:left w:val="single" w:sz="6" w:space="0" w:color="000000"/>
+              <w:bottom w:val="single" w:sz="6" w:space="0" w:color="000000"/>
+              <w:right w:val="single" w:sz="6" w:space="0" w:color="000000"/>
+            </w:tcBorders>
+            <w:tcMar>
+              <w:top w:w="120" w:type="dxa"/>
+              <w:left w:w="120" w:type="dxa"/>
+              <w:bottom w:w="120" w:type="dxa"/>
+              <w:right w:w="120" w:type="dxa"/>
+            </w:tcMar>
+            <w:vAlign w:val="center"/>
+            <w:hideMark/>
+          </w:tcPr>
+          <w:p>
+            <w:pPr>
+              <w:spacing w:after="300"/>
+              <w:rPr>
+                <w:rFonts w:ascii="Calibri" w:eastAsia="Times New Roman" w:hAnsi="Calibri" w:cs="Calibri"/>
+              </w:rPr>
+            </w:pPr>
+            <w:r>
+              <w:rPr>
+                <w:rFonts w:ascii="Calibri" w:eastAsia="Times New Roman" w:hAnsi="Calibri" w:cs="Calibri"/>
+              </w:rPr>
+              <w:t>Numerical</w:t>
+            </w:r>
+          </w:p>
+        </w:tc>
+      </w:tr>
     </w:tbl>
     <w:p>
       <w:pPr>
@@ -3128,175 +3431,7 @@
           <w:rStyle w:val="Emphasis"/>
           <w:rFonts w:ascii="Calibri" w:hAnsi="Calibri" w:cs="Calibri"/>
         </w:rPr>
-        <w:t>(Kích thư</w:t>
-      </w:r>
-      <w:r>
-        <w:rPr>
-          <w:rStyle w:val="Emphasis"/>
-          <w:rFonts w:ascii="Calibri" w:hAnsi="Calibri" w:cs="Calibri"/>
-        </w:rPr>
-        <w:t>ớ</w:t>
-      </w:r>
-      <w:r>
-        <w:rPr>
-          <w:rStyle w:val="Emphasis"/>
-          <w:rFonts w:ascii="Calibri" w:hAnsi="Calibri" w:cs="Calibri"/>
-        </w:rPr>
-        <w:t>c t</w:t>
-      </w:r>
-      <w:r>
-        <w:rPr>
-          <w:rStyle w:val="Emphasis"/>
-          <w:rFonts w:ascii="Calibri" w:hAnsi="Calibri" w:cs="Calibri"/>
-        </w:rPr>
-        <w:t>ậ</w:t>
-      </w:r>
-      <w:r>
-        <w:rPr>
-          <w:rStyle w:val="Emphasis"/>
-          <w:rFonts w:ascii="Calibri" w:hAnsi="Calibri" w:cs="Calibri"/>
-        </w:rPr>
-        <w:t>p d</w:t>
-      </w:r>
-      <w:r>
-        <w:rPr>
-          <w:rStyle w:val="Emphasis"/>
-          <w:rFonts w:ascii="Calibri" w:hAnsi="Calibri" w:cs="Calibri"/>
-        </w:rPr>
-        <w:t>ữ</w:t>
-      </w:r>
-      <w:r>
-        <w:rPr>
-          <w:rStyle w:val="Emphasis"/>
-          <w:rFonts w:ascii="Calibri" w:hAnsi="Calibri" w:cs="Calibri"/>
-        </w:rPr>
-        <w:t xml:space="preserve"> li</w:t>
-      </w:r>
-      <w:r>
-        <w:rPr>
-          <w:rStyle w:val="Emphasis"/>
-          <w:rFonts w:ascii="Calibri" w:hAnsi="Calibri" w:cs="Calibri"/>
-        </w:rPr>
-        <w:t>ệ</w:t>
-      </w:r>
-      <w:r>
-        <w:rPr>
-          <w:rStyle w:val="Emphasis"/>
-          <w:rFonts w:ascii="Calibri" w:hAnsi="Calibri" w:cs="Calibri"/>
-        </w:rPr>
-        <w:t>u [N rows x M columns] s</w:t>
-      </w:r>
-      <w:r>
-        <w:rPr>
-          <w:rStyle w:val="Emphasis"/>
-          <w:rFonts w:ascii="Calibri" w:hAnsi="Calibri" w:cs="Calibri"/>
-        </w:rPr>
-        <w:t>ẽ</w:t>
-      </w:r>
-      <w:r>
-        <w:rPr>
-          <w:rStyle w:val="Emphasis"/>
-          <w:rFonts w:ascii="Calibri" w:hAnsi="Calibri" w:cs="Calibri"/>
-        </w:rPr>
-        <w:t xml:space="preserve"> đư</w:t>
-      </w:r>
-      <w:r>
-        <w:rPr>
-          <w:rStyle w:val="Emphasis"/>
-          <w:rFonts w:ascii="Calibri" w:hAnsi="Calibri" w:cs="Calibri"/>
-        </w:rPr>
-        <w:t>ợ</w:t>
-      </w:r>
-      <w:r>
-        <w:rPr>
-          <w:rStyle w:val="Emphasis"/>
-          <w:rFonts w:ascii="Calibri" w:hAnsi="Calibri" w:cs="Calibri"/>
-        </w:rPr>
-        <w:t>c c</w:t>
-      </w:r>
-      <w:r>
-        <w:rPr>
-          <w:rStyle w:val="Emphasis"/>
-          <w:rFonts w:ascii="Calibri" w:hAnsi="Calibri" w:cs="Calibri"/>
-        </w:rPr>
-        <w:t>ậ</w:t>
-      </w:r>
-      <w:r>
-        <w:rPr>
-          <w:rStyle w:val="Emphasis"/>
-          <w:rFonts w:ascii="Calibri" w:hAnsi="Calibri" w:cs="Calibri"/>
-        </w:rPr>
-        <w:t>p nh</w:t>
-      </w:r>
-      <w:r>
-        <w:rPr>
-          <w:rStyle w:val="Emphasis"/>
-          <w:rFonts w:ascii="Calibri" w:hAnsi="Calibri" w:cs="Calibri"/>
-        </w:rPr>
-        <w:t>ậ</w:t>
-      </w:r>
-      <w:r>
-        <w:rPr>
-          <w:rStyle w:val="Emphasis"/>
-          <w:rFonts w:ascii="Calibri" w:hAnsi="Calibri" w:cs="Calibri"/>
-        </w:rPr>
-        <w:t>t sau khi load d</w:t>
-      </w:r>
-      <w:r>
-        <w:rPr>
-          <w:rStyle w:val="Emphasis"/>
-          <w:rFonts w:ascii="Calibri" w:hAnsi="Calibri" w:cs="Calibri"/>
-        </w:rPr>
-        <w:t>ữ</w:t>
-      </w:r>
-      <w:r>
-        <w:rPr>
-          <w:rStyle w:val="Emphasis"/>
-          <w:rFonts w:ascii="Calibri" w:hAnsi="Calibri" w:cs="Calibri"/>
-        </w:rPr>
-        <w:t xml:space="preserve"> li</w:t>
-      </w:r>
-      <w:r>
-        <w:rPr>
-          <w:rStyle w:val="Emphasis"/>
-          <w:rFonts w:ascii="Calibri" w:hAnsi="Calibri" w:cs="Calibri"/>
-        </w:rPr>
-        <w:t>ệ</w:t>
-      </w:r>
-      <w:r>
-        <w:rPr>
-          <w:rStyle w:val="Emphasis"/>
-          <w:rFonts w:ascii="Calibri" w:hAnsi="Calibri" w:cs="Calibri"/>
-        </w:rPr>
-        <w:t>u th</w:t>
-      </w:r>
-      <w:r>
-        <w:rPr>
-          <w:rStyle w:val="Emphasis"/>
-          <w:rFonts w:ascii="Calibri" w:hAnsi="Calibri" w:cs="Calibri"/>
-        </w:rPr>
-        <w:t>ự</w:t>
-      </w:r>
-      <w:r>
-        <w:rPr>
-          <w:rStyle w:val="Emphasis"/>
-          <w:rFonts w:ascii="Calibri" w:hAnsi="Calibri" w:cs="Calibri"/>
-        </w:rPr>
-        <w:t>c t</w:t>
-      </w:r>
-      <w:r>
-        <w:rPr>
-          <w:rStyle w:val="Emphasis"/>
-          <w:rFonts w:ascii="Calibri" w:hAnsi="Calibri" w:cs="Calibri"/>
-        </w:rPr>
-        <w:t>ế</w:t>
-      </w:r>
-      <w:r>
-        <w:rPr>
-          <w:rStyle w:val="Emphasis"/>
-          <w:rFonts w:ascii="Calibri" w:hAnsi="Calibri" w:cs="Calibri"/>
-        </w:rPr>
-        <w:t>).</w:t>
+        <w:t>Kích thước: 30.259 dòng x 90 cột. Sau khi làm sạch (01_data_cleaning.R) còn 21.350 dòng x 17 cột.</w:t>
       </w:r>
     </w:p>
     <w:p>
@@ -3650,6 +3785,107 @@
               <w:rPr>
                 <w:rStyle w:val="HTMLCode"/>
               </w:rPr>
+              <w:t>id</w:t>
+            </w:r>
+          </w:p>
+        </w:tc>
+        <w:tc>
+          <w:tcPr>
+            <w:tcW w:w="0" w:type="auto"/>
+            <w:tcBorders>
+              <w:top w:val="single" w:sz="6" w:space="0" w:color="000000"/>
+              <w:left w:val="single" w:sz="6" w:space="0" w:color="000000"/>
+              <w:bottom w:val="single" w:sz="6" w:space="0" w:color="000000"/>
+              <w:right w:val="single" w:sz="6" w:space="0" w:color="000000"/>
+            </w:tcBorders>
+            <w:tcMar>
+              <w:top w:w="120" w:type="dxa"/>
+              <w:left w:w="120" w:type="dxa"/>
+              <w:bottom w:w="120" w:type="dxa"/>
+              <w:right w:w="120" w:type="dxa"/>
+            </w:tcMar>
+            <w:vAlign w:val="center"/>
+            <w:hideMark/>
+          </w:tcPr>
+          <w:p>
+            <w:pPr>
+              <w:spacing w:after="300"/>
+              <w:rPr>
+                <w:rFonts w:ascii="Calibri" w:eastAsia="Times New Roman" w:hAnsi="Calibri" w:cs="Calibri"/>
+              </w:rPr>
+            </w:pPr>
+            <w:r>
+              <w:rPr>
+                <w:rFonts w:ascii="Calibri" w:eastAsia="Times New Roman" w:hAnsi="Calibri" w:cs="Calibri"/>
+              </w:rPr>
+              <w:t>Mã định danh duy nhất của đánh giá</w:t>
+            </w:r>
+          </w:p>
+        </w:tc>
+        <w:tc>
+          <w:tcPr>
+            <w:tcW w:w="0" w:type="auto"/>
+            <w:tcBorders>
+              <w:top w:val="single" w:sz="6" w:space="0" w:color="000000"/>
+              <w:left w:val="single" w:sz="6" w:space="0" w:color="000000"/>
+              <w:bottom w:val="single" w:sz="6" w:space="0" w:color="000000"/>
+              <w:right w:val="single" w:sz="6" w:space="0" w:color="000000"/>
+            </w:tcBorders>
+            <w:tcMar>
+              <w:top w:w="120" w:type="dxa"/>
+              <w:left w:w="120" w:type="dxa"/>
+              <w:bottom w:w="120" w:type="dxa"/>
+              <w:right w:w="120" w:type="dxa"/>
+            </w:tcMar>
+            <w:vAlign w:val="center"/>
+            <w:hideMark/>
+          </w:tcPr>
+          <w:p>
+            <w:pPr>
+              <w:spacing w:after="300"/>
+              <w:rPr>
+                <w:rFonts w:ascii="Calibri" w:eastAsia="Times New Roman" w:hAnsi="Calibri" w:cs="Calibri"/>
+              </w:rPr>
+            </w:pPr>
+            <w:r>
+              <w:rPr>
+                <w:rFonts w:ascii="Calibri" w:eastAsia="Times New Roman" w:hAnsi="Calibri" w:cs="Calibri"/>
+              </w:rPr>
+              <w:t>Numerical</w:t>
+            </w:r>
+          </w:p>
+        </w:tc>
+      </w:tr>
+      <w:tr>
+        <w:tc>
+          <w:tcPr>
+            <w:tcW w:w="0" w:type="auto"/>
+            <w:tcBorders>
+              <w:top w:val="single" w:sz="6" w:space="0" w:color="000000"/>
+              <w:left w:val="single" w:sz="6" w:space="0" w:color="000000"/>
+              <w:bottom w:val="single" w:sz="6" w:space="0" w:color="000000"/>
+              <w:right w:val="single" w:sz="6" w:space="0" w:color="000000"/>
+            </w:tcBorders>
+            <w:tcMar>
+              <w:top w:w="120" w:type="dxa"/>
+              <w:left w:w="120" w:type="dxa"/>
+              <w:bottom w:w="120" w:type="dxa"/>
+              <w:right w:w="120" w:type="dxa"/>
+            </w:tcMar>
+            <w:vAlign w:val="center"/>
+            <w:hideMark/>
+          </w:tcPr>
+          <w:p>
+            <w:pPr>
+              <w:spacing w:after="300"/>
+              <w:rPr>
+                <w:rFonts w:ascii="Calibri" w:eastAsia="Times New Roman" w:hAnsi="Calibri" w:cs="Calibri"/>
+              </w:rPr>
+            </w:pPr>
+            <w:r>
+              <w:rPr>
+                <w:rStyle w:val="HTMLCode"/>
+              </w:rPr>
               <w:t>date</w:t>
             </w:r>
           </w:p>
@@ -3835,175 +4071,7 @@
           <w:rStyle w:val="Emphasis"/>
           <w:rFonts w:ascii="Calibri" w:hAnsi="Calibri" w:cs="Calibri"/>
         </w:rPr>
-        <w:t>(Kích thư</w:t>
-      </w:r>
-      <w:r>
-        <w:rPr>
-          <w:rStyle w:val="Emphasis"/>
-          <w:rFonts w:ascii="Calibri" w:hAnsi="Calibri" w:cs="Calibri"/>
-        </w:rPr>
-        <w:t>ớ</w:t>
-      </w:r>
-      <w:r>
-        <w:rPr>
-          <w:rStyle w:val="Emphasis"/>
-          <w:rFonts w:ascii="Calibri" w:hAnsi="Calibri" w:cs="Calibri"/>
-        </w:rPr>
-        <w:t>c t</w:t>
-      </w:r>
-      <w:r>
-        <w:rPr>
-          <w:rStyle w:val="Emphasis"/>
-          <w:rFonts w:ascii="Calibri" w:hAnsi="Calibri" w:cs="Calibri"/>
-        </w:rPr>
-        <w:t>ậ</w:t>
-      </w:r>
-      <w:r>
-        <w:rPr>
-          <w:rStyle w:val="Emphasis"/>
-          <w:rFonts w:ascii="Calibri" w:hAnsi="Calibri" w:cs="Calibri"/>
-        </w:rPr>
-        <w:t>p d</w:t>
-      </w:r>
-      <w:r>
-        <w:rPr>
-          <w:rStyle w:val="Emphasis"/>
-          <w:rFonts w:ascii="Calibri" w:hAnsi="Calibri" w:cs="Calibri"/>
-        </w:rPr>
-        <w:t>ữ</w:t>
-      </w:r>
-      <w:r>
-        <w:rPr>
-          <w:rStyle w:val="Emphasis"/>
-          <w:rFonts w:ascii="Calibri" w:hAnsi="Calibri" w:cs="Calibri"/>
-        </w:rPr>
-        <w:t xml:space="preserve"> li</w:t>
-      </w:r>
-      <w:r>
-        <w:rPr>
-          <w:rStyle w:val="Emphasis"/>
-          <w:rFonts w:ascii="Calibri" w:hAnsi="Calibri" w:cs="Calibri"/>
-        </w:rPr>
-        <w:t>ệ</w:t>
-      </w:r>
-      <w:r>
-        <w:rPr>
-          <w:rStyle w:val="Emphasis"/>
-          <w:rFonts w:ascii="Calibri" w:hAnsi="Calibri" w:cs="Calibri"/>
-        </w:rPr>
-        <w:t>u [N rows x M columns] s</w:t>
-      </w:r>
-      <w:r>
-        <w:rPr>
-          <w:rStyle w:val="Emphasis"/>
-          <w:rFonts w:ascii="Calibri" w:hAnsi="Calibri" w:cs="Calibri"/>
-        </w:rPr>
-        <w:t>ẽ</w:t>
-      </w:r>
-      <w:r>
-        <w:rPr>
-          <w:rStyle w:val="Emphasis"/>
-          <w:rFonts w:ascii="Calibri" w:hAnsi="Calibri" w:cs="Calibri"/>
-        </w:rPr>
-        <w:t xml:space="preserve"> đư</w:t>
-      </w:r>
-      <w:r>
-        <w:rPr>
-          <w:rStyle w:val="Emphasis"/>
-          <w:rFonts w:ascii="Calibri" w:hAnsi="Calibri" w:cs="Calibri"/>
-        </w:rPr>
-        <w:t>ợ</w:t>
-      </w:r>
-      <w:r>
-        <w:rPr>
-          <w:rStyle w:val="Emphasis"/>
-          <w:rFonts w:ascii="Calibri" w:hAnsi="Calibri" w:cs="Calibri"/>
-        </w:rPr>
-        <w:t>c c</w:t>
-      </w:r>
-      <w:r>
-        <w:rPr>
-          <w:rStyle w:val="Emphasis"/>
-          <w:rFonts w:ascii="Calibri" w:hAnsi="Calibri" w:cs="Calibri"/>
-        </w:rPr>
-        <w:t>ậ</w:t>
-      </w:r>
-      <w:r>
-        <w:rPr>
-          <w:rStyle w:val="Emphasis"/>
-          <w:rFonts w:ascii="Calibri" w:hAnsi="Calibri" w:cs="Calibri"/>
-        </w:rPr>
-        <w:t>p nh</w:t>
-      </w:r>
-      <w:r>
-        <w:rPr>
-          <w:rStyle w:val="Emphasis"/>
-          <w:rFonts w:ascii="Calibri" w:hAnsi="Calibri" w:cs="Calibri"/>
-        </w:rPr>
-        <w:t>ậ</w:t>
-      </w:r>
-      <w:r>
-        <w:rPr>
-          <w:rStyle w:val="Emphasis"/>
-          <w:rFonts w:ascii="Calibri" w:hAnsi="Calibri" w:cs="Calibri"/>
-        </w:rPr>
-        <w:t>t sau khi load d</w:t>
-      </w:r>
-      <w:r>
-        <w:rPr>
-          <w:rStyle w:val="Emphasis"/>
-          <w:rFonts w:ascii="Calibri" w:hAnsi="Calibri" w:cs="Calibri"/>
-        </w:rPr>
-        <w:t>ữ</w:t>
-      </w:r>
-      <w:r>
-        <w:rPr>
-          <w:rStyle w:val="Emphasis"/>
-          <w:rFonts w:ascii="Calibri" w:hAnsi="Calibri" w:cs="Calibri"/>
-        </w:rPr>
-        <w:t xml:space="preserve"> li</w:t>
-      </w:r>
-      <w:r>
-        <w:rPr>
-          <w:rStyle w:val="Emphasis"/>
-          <w:rFonts w:ascii="Calibri" w:hAnsi="Calibri" w:cs="Calibri"/>
-        </w:rPr>
-        <w:t>ệ</w:t>
-      </w:r>
-      <w:r>
-        <w:rPr>
-          <w:rStyle w:val="Emphasis"/>
-          <w:rFonts w:ascii="Calibri" w:hAnsi="Calibri" w:cs="Calibri"/>
-        </w:rPr>
-        <w:t>u th</w:t>
-      </w:r>
-      <w:r>
-        <w:rPr>
-          <w:rStyle w:val="Emphasis"/>
-          <w:rFonts w:ascii="Calibri" w:hAnsi="Calibri" w:cs="Calibri"/>
-        </w:rPr>
-        <w:t>ự</w:t>
-      </w:r>
-      <w:r>
-        <w:rPr>
-          <w:rStyle w:val="Emphasis"/>
-          <w:rFonts w:ascii="Calibri" w:hAnsi="Calibri" w:cs="Calibri"/>
-        </w:rPr>
-        <w:t>c t</w:t>
-      </w:r>
-      <w:r>
-        <w:rPr>
-          <w:rStyle w:val="Emphasis"/>
-          <w:rFonts w:ascii="Calibri" w:hAnsi="Calibri" w:cs="Calibri"/>
-        </w:rPr>
-        <w:t>ế</w:t>
-      </w:r>
-      <w:r>
-        <w:rPr>
-          <w:rStyle w:val="Emphasis"/>
-          <w:rFonts w:ascii="Calibri" w:hAnsi="Calibri" w:cs="Calibri"/>
-        </w:rPr>
-        <w:t>).</w:t>
+        <w:t>Kích thước: 990.170 dòng x 6 cột (listing_id, id, date, reviewer_id, reviewer_name, comments). 9.618 đánh giá thuộc 239 listing không có trong listings.csv nên sẽ bị loại khi ghép (join). File gốc nặng 310 MB, vượt giới hạn 100 MB/file của GitHub, nên repo lưu bản nén data/reviews.csv.xz (73 MB); readr đọc trực tiếp file này.</w:t>
       </w:r>
     </w:p>
     <w:p>
@@ -4588,7 +4656,7 @@
           <w:sz w:val="21"/>
           <w:szCs w:val="21"/>
         </w:rPr>
-        <w:t>Phân tích phân phối và áp dụng phương pháp thống kê để khoanh vùng outliers.</w:t>
+        <w:t>Phân tích phân phối: price lệch phải mạnh (trung vị 174,69$, trung bình 278,2$, cao nhất 30.972,96$/đêm). Ngưỡng IQR (Q3 + 1,5 x IQR = 611,5$) loại 1.608 listing (7,5%), gồm cả nhiều listing cao cấp thật, nên nhóm không dùng IQR.</w:t>
       </w:r>
     </w:p>
     <w:p>
@@ -4646,24 +4714,7 @@
           <w:sz w:val="21"/>
           <w:szCs w:val="21"/>
         </w:rPr>
-        <w:t xml:space="preserve">Việc xử lý outliers sẽ được cân nhắc cẩn thận dựa trên </w:t>
-      </w:r>
-      <w:r>
-        <w:rPr>
-          <w:rStyle w:val="Strong"/>
-          <w:rFonts w:ascii="Calibri" w:eastAsia="Times New Roman" w:hAnsi="Calibri" w:cs="Calibri"/>
-          <w:sz w:val="21"/>
-          <w:szCs w:val="21"/>
-        </w:rPr>
-        <w:t>quy luật kinh doanh (business rules)</w:t>
-      </w:r>
-      <w:r>
-        <w:rPr>
-          <w:rFonts w:ascii="Calibri" w:eastAsia="Times New Roman" w:hAnsi="Calibri" w:cs="Calibri"/>
-          <w:sz w:val="21"/>
-          <w:szCs w:val="21"/>
-        </w:rPr>
-        <w:t>, nhằm giữ lại các listing cao cấp thực sự tồn tại trên thị trường.</w:t>
+        <w:t>Áp dụng ngưỡng theo quy luật kinh doanh (business rules): giữ 0 &lt; price &lt;= 2.000$/đêm và 0 &lt; minimum_nights &lt;= 365. Ngưỡng giá chỉ loại 164 listing (0,76% số listing có giá) và vẫn giữ 458 listing cao cấp có giá 1.000–2.000$/đêm.</w:t>
       </w:r>
     </w:p>
     <w:p>
@@ -4721,7 +4772,7 @@
           <w:sz w:val="21"/>
           <w:szCs w:val="21"/>
         </w:rPr>
-        <w:t>Tùy thuộc vào mức độ quan trọng của biến, sẽ áp dụng các kỹ thuật điền thế (imputation) hoặc loại bỏ (removal) phù hợp.</w:t>
+        <w:t>Kết quả: price thiếu 8.744 giá trị (28,9%); 77,7% các listing này có availability_365 = 0 (không còn hoạt động), nên loại bỏ. reviews_per_month thiếu 8.559 giá trị, đúng bằng số listing chưa có đánh giá, nên điền 0. first_review, last_review và review_scores_rating cũng trống ở các listing này: giữ NA và thêm cờ has_reviews khi chuẩn bị mô hình.</w:t>
       </w:r>
     </w:p>
     <w:p>
@@ -4757,49 +4808,119 @@
           <w:sz w:val="21"/>
           <w:szCs w:val="21"/>
         </w:rPr>
-        <w:t xml:space="preserve">Nhận diện và xóa bỏ các bản ghi trùng lặp (dựa trên </w:t>
+        <w:t>Kiểm tra trùng lặp theo khóa id: listings có 0 id trùng, reviews có 0 id đánh giá trùng. Không xóa theo listing_id, vì mỗi listing có nhiều đánh giá hợp lệ.</w:t>
+      </w:r>
+    </w:p>
+    <w:p>
+      <w:pPr>
+        <w:pStyle w:val="Heading4"/>
+        <w:rPr>
+          <w:rFonts w:ascii="Calibri" w:eastAsia="Times New Roman" w:hAnsi="Calibri" w:cs="Calibri"/>
+        </w:rPr>
+      </w:pPr>
+      <w:r>
+        <w:rPr>
+          <w:rFonts w:ascii="Calibri" w:eastAsia="Times New Roman" w:hAnsi="Calibri" w:cs="Calibri"/>
+        </w:rPr>
+        <w:t>4.4. Tiền Xử Lý Dữ Liệu Text (Text Processing)</w:t>
+      </w:r>
+    </w:p>
+    <w:p>
+      <w:pPr>
+        <w:pStyle w:val="NormalWeb"/>
+        <w:rPr>
+          <w:rFonts w:ascii="Calibri" w:hAnsi="Calibri" w:cs="Calibri"/>
+        </w:rPr>
+      </w:pPr>
+      <w:r>
+        <w:rPr>
+          <w:rFonts w:ascii="Calibri" w:hAnsi="Calibri" w:cs="Calibri"/>
+        </w:rPr>
+        <w:t>C</w:t>
+      </w:r>
+      <w:r>
+        <w:rPr>
+          <w:rFonts w:ascii="Calibri" w:hAnsi="Calibri" w:cs="Calibri"/>
+        </w:rPr>
+        <w:t>ộ</w:t>
+      </w:r>
+      <w:r>
+        <w:rPr>
+          <w:rFonts w:ascii="Calibri" w:hAnsi="Calibri" w:cs="Calibri"/>
+        </w:rPr>
+        <w:t xml:space="preserve">t </w:t>
       </w:r>
       <w:r>
         <w:rPr>
           <w:rStyle w:val="HTMLCode"/>
         </w:rPr>
-        <w:t>id</w:t>
-      </w:r>
-      <w:r>
-        <w:rPr>
-          <w:rFonts w:ascii="Calibri" w:eastAsia="Times New Roman" w:hAnsi="Calibri" w:cs="Calibri"/>
-          <w:sz w:val="21"/>
-          <w:szCs w:val="21"/>
-        </w:rPr>
-        <w:t xml:space="preserve"> hoặc </w:t>
-      </w:r>
-      <w:r>
-        <w:rPr>
-          <w:rStyle w:val="HTMLCode"/>
-        </w:rPr>
-        <w:t>listing_id</w:t>
-      </w:r>
-      <w:r>
-        <w:rPr>
-          <w:rFonts w:ascii="Calibri" w:eastAsia="Times New Roman" w:hAnsi="Calibri" w:cs="Calibri"/>
-          <w:sz w:val="21"/>
-          <w:szCs w:val="21"/>
-        </w:rPr>
-        <w:t>) để đảm bảo tính toàn vẹn của báo cáo.</w:t>
-      </w:r>
-    </w:p>
-    <w:p>
-      <w:pPr>
-        <w:pStyle w:val="Heading4"/>
-        <w:rPr>
-          <w:rFonts w:ascii="Calibri" w:eastAsia="Times New Roman" w:hAnsi="Calibri" w:cs="Calibri"/>
-        </w:rPr>
-      </w:pPr>
-      <w:r>
-        <w:rPr>
-          <w:rFonts w:ascii="Calibri" w:eastAsia="Times New Roman" w:hAnsi="Calibri" w:cs="Calibri"/>
-        </w:rPr>
-        <w:t>4.4. Tiền Xử Lý Dữ Liệu Text (Text Processing)</w:t>
+        <w:t>comments</w:t>
+      </w:r>
+      <w:r>
+        <w:rPr>
+          <w:rFonts w:ascii="Calibri" w:hAnsi="Calibri" w:cs="Calibri"/>
+        </w:rPr>
+        <w:t xml:space="preserve"> trong t</w:t>
+      </w:r>
+      <w:r>
+        <w:rPr>
+          <w:rFonts w:ascii="Calibri" w:hAnsi="Calibri" w:cs="Calibri"/>
+        </w:rPr>
+        <w:t>ậ</w:t>
+      </w:r>
+      <w:r>
+        <w:rPr>
+          <w:rFonts w:ascii="Calibri" w:hAnsi="Calibri" w:cs="Calibri"/>
+        </w:rPr>
+        <w:t>p reviews s</w:t>
+      </w:r>
+      <w:r>
+        <w:rPr>
+          <w:rFonts w:ascii="Calibri" w:hAnsi="Calibri" w:cs="Calibri"/>
+        </w:rPr>
+        <w:t>ẽ</w:t>
+      </w:r>
+      <w:r>
+        <w:rPr>
+          <w:rFonts w:ascii="Calibri" w:hAnsi="Calibri" w:cs="Calibri"/>
+        </w:rPr>
+        <w:t xml:space="preserve"> tr</w:t>
+      </w:r>
+      <w:r>
+        <w:rPr>
+          <w:rFonts w:ascii="Calibri" w:hAnsi="Calibri" w:cs="Calibri"/>
+        </w:rPr>
+        <w:t>ả</w:t>
+      </w:r>
+      <w:r>
+        <w:rPr>
+          <w:rFonts w:ascii="Calibri" w:hAnsi="Calibri" w:cs="Calibri"/>
+        </w:rPr>
+        <w:t>i qua các bư</w:t>
+      </w:r>
+      <w:r>
+        <w:rPr>
+          <w:rFonts w:ascii="Calibri" w:hAnsi="Calibri" w:cs="Calibri"/>
+        </w:rPr>
+        <w:t>ớ</w:t>
+      </w:r>
+      <w:r>
+        <w:rPr>
+          <w:rFonts w:ascii="Calibri" w:hAnsi="Calibri" w:cs="Calibri"/>
+        </w:rPr>
+        <w:t>c chu</w:t>
+      </w:r>
+      <w:r>
+        <w:rPr>
+          <w:rFonts w:ascii="Calibri" w:hAnsi="Calibri" w:cs="Calibri"/>
+        </w:rPr>
+        <w:t>ẩ</w:t>
+      </w:r>
+      <w:r>
+        <w:rPr>
+          <w:rFonts w:ascii="Calibri" w:hAnsi="Calibri" w:cs="Calibri"/>
+        </w:rPr>
+        <w:t>n hóa:</w:t>
       </w:r>
     </w:p>
     <w:p>
@@ -4813,91 +4934,7 @@
         <w:rPr>
           <w:rFonts w:ascii="Calibri" w:hAnsi="Calibri" w:cs="Calibri"/>
         </w:rPr>
-        <w:t>C</w:t>
-      </w:r>
-      <w:r>
-        <w:rPr>
-          <w:rFonts w:ascii="Calibri" w:hAnsi="Calibri" w:cs="Calibri"/>
-        </w:rPr>
-        <w:t>ộ</w:t>
-      </w:r>
-      <w:r>
-        <w:rPr>
-          <w:rFonts w:ascii="Calibri" w:hAnsi="Calibri" w:cs="Calibri"/>
-        </w:rPr>
-        <w:t xml:space="preserve">t </w:t>
-      </w:r>
-      <w:r>
-        <w:rPr>
-          <w:rStyle w:val="HTMLCode"/>
-        </w:rPr>
-        <w:t>comments</w:t>
-      </w:r>
-      <w:r>
-        <w:rPr>
-          <w:rFonts w:ascii="Calibri" w:hAnsi="Calibri" w:cs="Calibri"/>
-        </w:rPr>
-        <w:t xml:space="preserve"> trong t</w:t>
-      </w:r>
-      <w:r>
-        <w:rPr>
-          <w:rFonts w:ascii="Calibri" w:hAnsi="Calibri" w:cs="Calibri"/>
-        </w:rPr>
-        <w:t>ậ</w:t>
-      </w:r>
-      <w:r>
-        <w:rPr>
-          <w:rFonts w:ascii="Calibri" w:hAnsi="Calibri" w:cs="Calibri"/>
-        </w:rPr>
-        <w:t>p reviews s</w:t>
-      </w:r>
-      <w:r>
-        <w:rPr>
-          <w:rFonts w:ascii="Calibri" w:hAnsi="Calibri" w:cs="Calibri"/>
-        </w:rPr>
-        <w:t>ẽ</w:t>
-      </w:r>
-      <w:r>
-        <w:rPr>
-          <w:rFonts w:ascii="Calibri" w:hAnsi="Calibri" w:cs="Calibri"/>
-        </w:rPr>
-        <w:t xml:space="preserve"> tr</w:t>
-      </w:r>
-      <w:r>
-        <w:rPr>
-          <w:rFonts w:ascii="Calibri" w:hAnsi="Calibri" w:cs="Calibri"/>
-        </w:rPr>
-        <w:t>ả</w:t>
-      </w:r>
-      <w:r>
-        <w:rPr>
-          <w:rFonts w:ascii="Calibri" w:hAnsi="Calibri" w:cs="Calibri"/>
-        </w:rPr>
-        <w:t>i qua các bư</w:t>
-      </w:r>
-      <w:r>
-        <w:rPr>
-          <w:rFonts w:ascii="Calibri" w:hAnsi="Calibri" w:cs="Calibri"/>
-        </w:rPr>
-        <w:t>ớ</w:t>
-      </w:r>
-      <w:r>
-        <w:rPr>
-          <w:rFonts w:ascii="Calibri" w:hAnsi="Calibri" w:cs="Calibri"/>
-        </w:rPr>
-        <w:t>c chu</w:t>
-      </w:r>
-      <w:r>
-        <w:rPr>
-          <w:rFonts w:ascii="Calibri" w:hAnsi="Calibri" w:cs="Calibri"/>
-        </w:rPr>
-        <w:t>ẩ</w:t>
-      </w:r>
-      <w:r>
-        <w:rPr>
-          <w:rFonts w:ascii="Calibri" w:hAnsi="Calibri" w:cs="Calibri"/>
-        </w:rPr>
-        <w:t>n hóa:</w:t>
+        <w:t>Bỏ cột reviewer_name và reviewer_id (dữ liệu cá nhân, không cần cho phân tích).</w:t>
       </w:r>
     </w:p>
     <w:p>
@@ -4919,7 +4956,7 @@
           <w:sz w:val="21"/>
           <w:szCs w:val="21"/>
         </w:rPr>
-        <w:t>Loại bỏ bình luận trống hoặc missing.</w:t>
+        <w:t>Loại bỏ bình luận trống hoặc quá ngắn (tối đa 3 ký tự, gồm cả giá trị "NA"): 4.012 bình luận.</w:t>
       </w:r>
     </w:p>
     <w:p>
@@ -4963,7 +5000,7 @@
           <w:sz w:val="21"/>
           <w:szCs w:val="21"/>
         </w:rPr>
-        <w:t>Xóa các ký tự đặc biệt, dấu câu không cần thiết.</w:t>
+        <w:t>Xóa thẻ HTML (&lt;br/&gt; có trong 16,4% bình luận), ký tự đặc biệt và dấu câu không cần thiết.</w:t>
       </w:r>
     </w:p>
     <w:p>
@@ -4985,7 +5022,7 @@
           <w:sz w:val="21"/>
           <w:szCs w:val="21"/>
         </w:rPr>
-        <w:t>Token hóa văn bản (Tokenization).</w:t>
+        <w:t>Lọc bình luận không phải tiếng Anh (ước tính khoảng 17%) bằng gói cld2 trước khi dùng từ điển cảm xúc tiếng Anh.</w:t>
       </w:r>
     </w:p>
     <w:p>
@@ -5007,7 +5044,7 @@
           <w:sz w:val="21"/>
           <w:szCs w:val="21"/>
         </w:rPr>
-        <w:t>Lọc bỏ các từ dừng (Stop words).</w:t>
+        <w:t>Token hóa văn bản (Tokenization).</w:t>
       </w:r>
     </w:p>
     <w:p>
@@ -5029,6 +5066,28 @@
           <w:sz w:val="21"/>
           <w:szCs w:val="21"/>
         </w:rPr>
+        <w:t>Lọc bỏ các từ dừng (Stop words).</w:t>
+      </w:r>
+    </w:p>
+    <w:p>
+      <w:pPr>
+        <w:numPr>
+          <w:ilvl w:val="0"/>
+          <w:numId w:val="12"/>
+        </w:numPr>
+        <w:spacing w:before="100" w:beforeAutospacing="1" w:after="100" w:afterAutospacing="1"/>
+        <w:rPr>
+          <w:rFonts w:ascii="Calibri" w:eastAsia="Times New Roman" w:hAnsi="Calibri" w:cs="Calibri"/>
+          <w:sz w:val="21"/>
+          <w:szCs w:val="21"/>
+        </w:rPr>
+      </w:pPr>
+      <w:r>
+        <w:rPr>
+          <w:rFonts w:ascii="Calibri" w:eastAsia="Times New Roman" w:hAnsi="Calibri" w:cs="Calibri"/>
+          <w:sz w:val="21"/>
+          <w:szCs w:val="21"/>
+        </w:rPr>
         <w:t xml:space="preserve">Ứng dụng </w:t>
       </w:r>
       <w:r>
@@ -5174,7 +5233,7 @@
           <w:sz w:val="21"/>
           <w:szCs w:val="21"/>
         </w:rPr>
-        <w:t>Vị trí (Neighbourhood), Loại phòng, Số đêm tối thiểu, Tương tác đánh giá (số lượng, tần suất) và mức độ khả dụng.</w:t>
+        <w:t>Vị trí (neighbourhood_group, neighbourhood), Loại phòng, Sức chứa (accommodates), Loại hình lưu trú (stay_type: ngắn hạn &lt; 30 đêm / dài hạn &gt;= 30 đêm), Tương tác đánh giá (số lượng, tần suất) và mức độ khả dụng. Dùng stay_type thay cho số đêm tối thiểu: theo NYC Local Law 18 (09/2023), 76,8% listing có giá yêu cầu từ 30 đêm, với giá trung vị 142$ so với 304$ của nhóm ngắn hạn.</w:t>
       </w:r>
     </w:p>
     <w:p>
@@ -5368,7 +5427,7 @@
           <w:sz w:val="21"/>
           <w:szCs w:val="21"/>
         </w:rPr>
-        <w:t>Trích xuất chủ đề (topics) và phân tích sắc thái phản hồi (nếu cần).</w:t>
+        <w:t>Trích xuất chủ đề (topics) và phân tích sắc thái phản hồi. So sánh từ khóa TF-IDF giữa nhóm điểm cao (review_scores_rating = 5,0: 6.606 listing) và nhóm thấp (&lt; 4,5: 2.868 listing); không chia theo trung vị vì trung vị đã là 4,86.</w:t>
       </w:r>
     </w:p>
     <w:p>

</xml_diff>